<commit_message>
Lock signer position to selected person profile
Updated the person picker to support `data-picker-fill` fields so position values are always derived from the selected person and cleared when no person is selected. In doc form 3, the dean position field is now readonly, visually marked as system-filled, and includes guidance to fix source personnel data instead of editing in-form. Admin field locking was also tightened to disable non-office action buttons (like add/remove row controls) while keeping preview and office save flows available when needed. Updated the related Phase 2 DOCX template to align with this behavior.
</commit_message>
<xml_diff>
--- a/HRCP-KKU-Academic/src/main/resources/templates/docx/Phase2/p2doc_7.docx
+++ b/HRCP-KKU-Academic/src/main/resources/templates/docx/Phase2/p2doc_7.docx
@@ -4210,26 +4210,16 @@
                 <w:szCs w:val="30"/>
                 <w:cs/>
               </w:rPr>
-              <w:t>อรับรองว่าผลงานที่ส่งมามีเนื้อหา</w:t>
-            </w:r>
-          </w:p>
-          <w:p>
-            <w:pPr>
-              <w:rPr>
-                <w:rFonts w:ascii="TH Sarabun New" w:hAnsi="TH Sarabun New" w:cs="TH Sarabun New"/>
-                <w:sz w:val="30"/>
-                <w:szCs w:val="30"/>
-                <w:cs/>
-              </w:rPr>
-            </w:pPr>
-            <w:r>
-              <w:rPr>
-                <w:rFonts w:ascii="TH Sarabun New" w:hAnsi="TH Sarabun New" w:cs="TH Sarabun New"/>
-                <w:sz w:val="30"/>
-                <w:szCs w:val="30"/>
-                <w:cs/>
-              </w:rPr>
-              <w:t xml:space="preserve">   </w:t>
+              <w:t xml:space="preserve">อรับรองว่าผลงานที่ส่งมามีเนื้อหา</w:t>
+            </w:r>
+            <w:r>
+              <w:rPr>
+                <w:rFonts w:ascii="TH Sarabun New" w:hAnsi="TH Sarabun New" w:cs="TH Sarabun New"/>
+                <w:sz w:val="30"/>
+                <w:szCs w:val="30"/>
+                <w:cs/>
+              </w:rPr>
+              <w:t xml:space="preserve"/>
             </w:r>
             <w:r>
               <w:rPr>
@@ -4379,26 +4369,16 @@
                 <w:szCs w:val="30"/>
                 <w:cs/>
               </w:rPr>
-              <w:t xml:space="preserve">ที่อยู่ใน  </w:t>
-            </w:r>
-          </w:p>
-          <w:p>
-            <w:pPr>
-              <w:rPr>
-                <w:rFonts w:ascii="TH Sarabun New" w:hAnsi="TH Sarabun New" w:cs="TH Sarabun New"/>
-                <w:sz w:val="30"/>
-                <w:szCs w:val="30"/>
-                <w:cs/>
-              </w:rPr>
-            </w:pPr>
-            <w:r>
-              <w:rPr>
-                <w:rFonts w:ascii="TH Sarabun New" w:hAnsi="TH Sarabun New" w:cs="TH Sarabun New"/>
-                <w:sz w:val="30"/>
-                <w:szCs w:val="30"/>
-                <w:cs/>
-              </w:rPr>
-              <w:t xml:space="preserve">      ฐาน</w:t>
+              <w:t xml:space="preserve">ที่อยู่ใน </w:t>
+            </w:r>
+            <w:r>
+              <w:rPr>
+                <w:rFonts w:ascii="TH Sarabun New" w:hAnsi="TH Sarabun New" w:cs="TH Sarabun New"/>
+                <w:sz w:val="30"/>
+                <w:szCs w:val="30"/>
+                <w:cs/>
+              </w:rPr>
+              <w:t xml:space="preserve">ฐาน</w:t>
             </w:r>
             <w:r>
               <w:rPr>
@@ -6435,26 +6415,16 @@
                 <w:szCs w:val="30"/>
                 <w:cs/>
               </w:rPr>
-              <w:t xml:space="preserve">   </w:t>
-            </w:r>
-          </w:p>
-          <w:p>
-            <w:pPr>
-              <w:jc w:val="thaiDistribute"/>
-              <w:rPr>
-                <w:rFonts w:ascii="TH Sarabun New" w:hAnsi="TH Sarabun New" w:cs="TH Sarabun New"/>
-                <w:sz w:val="30"/>
-                <w:szCs w:val="30"/>
-              </w:rPr>
-            </w:pPr>
-            <w:r>
-              <w:rPr>
-                <w:rFonts w:ascii="TH Sarabun New" w:hAnsi="TH Sarabun New" w:cs="TH Sarabun New"/>
-                <w:sz w:val="30"/>
-                <w:szCs w:val="30"/>
-                <w:cs/>
-              </w:rPr>
-              <w:t xml:space="preserve">           </w:t>
+              <w:t xml:space="preserve"> </w:t>
+            </w:r>
+            <w:r>
+              <w:rPr>
+                <w:rFonts w:ascii="TH Sarabun New" w:hAnsi="TH Sarabun New" w:cs="TH Sarabun New"/>
+                <w:sz w:val="30"/>
+                <w:szCs w:val="30"/>
+                <w:cs/>
+              </w:rPr>
+              <w:t xml:space="preserve"/>
             </w:r>
             <w:r>
               <w:rPr>
@@ -7434,27 +7404,16 @@
                 <w:szCs w:val="30"/>
                 <w:cs/>
               </w:rPr>
-              <w:t>แหล่งรวบรวมกรณีศึกษาที่มีบรรณาธิการโดยมี</w:t>
-            </w:r>
-          </w:p>
-          <w:p>
-            <w:pPr>
-              <w:jc w:val="thaiDistribute"/>
-              <w:rPr>
-                <w:rFonts w:ascii="TH Sarabun New" w:hAnsi="TH Sarabun New" w:cs="TH Sarabun New"/>
-                <w:sz w:val="30"/>
-                <w:szCs w:val="30"/>
-                <w:cs/>
-              </w:rPr>
-            </w:pPr>
-            <w:r>
-              <w:rPr>
-                <w:rFonts w:ascii="TH Sarabun New" w:hAnsi="TH Sarabun New" w:cs="TH Sarabun New"/>
-                <w:sz w:val="30"/>
-                <w:szCs w:val="30"/>
-                <w:cs/>
-              </w:rPr>
-              <w:t xml:space="preserve">     </w:t>
+              <w:t xml:space="preserve">แหล่งรวบรวมกรณีศึกษาที่มีบรรณาธิการโดยมี</w:t>
+            </w:r>
+            <w:r>
+              <w:rPr>
+                <w:rFonts w:ascii="TH Sarabun New" w:hAnsi="TH Sarabun New" w:cs="TH Sarabun New"/>
+                <w:sz w:val="30"/>
+                <w:szCs w:val="30"/>
+                <w:cs/>
+              </w:rPr>
+              <w:t xml:space="preserve"/>
             </w:r>
             <w:r>
               <w:rPr>
@@ -8691,41 +8650,23 @@
               </w:rPr>
               <w:t xml:space="preserve">จัดนิทรรศการ จัดแสดง จัดการแสดง </w:t>
             </w:r>
-          </w:p>
-          <w:p>
-            <w:pPr>
-              <w:rPr>
-                <w:rFonts w:ascii="TH Sarabun New" w:hAnsi="TH Sarabun New" w:cs="TH Sarabun New"/>
-                <w:sz w:val="30"/>
-                <w:szCs w:val="30"/>
-              </w:rPr>
-            </w:pPr>
-            <w:r>
-              <w:rPr>
-                <w:rFonts w:ascii="TH Sarabun New" w:hAnsi="TH Sarabun New" w:cs="TH Sarabun New"/>
-                <w:sz w:val="30"/>
-                <w:szCs w:val="30"/>
-                <w:cs/>
-              </w:rPr>
-              <w:t xml:space="preserve">     แสดงสาธารณะ บันทึกภาพ บันทึกเสียง ภาพถ่าย </w:t>
-            </w:r>
-          </w:p>
-          <w:p>
-            <w:pPr>
-              <w:rPr>
-                <w:rFonts w:ascii="TH Sarabun New" w:hAnsi="TH Sarabun New" w:cs="TH Sarabun New"/>
-                <w:sz w:val="30"/>
-                <w:szCs w:val="30"/>
-              </w:rPr>
-            </w:pPr>
-            <w:r>
-              <w:rPr>
-                <w:rFonts w:ascii="TH Sarabun New" w:hAnsi="TH Sarabun New" w:cs="TH Sarabun New"/>
-                <w:sz w:val="30"/>
-                <w:szCs w:val="30"/>
-                <w:cs/>
-              </w:rPr>
-              <w:t xml:space="preserve">     แถบบันทึกภาพ</w:t>
+            <w:r>
+              <w:rPr>
+                <w:rFonts w:ascii="TH Sarabun New" w:hAnsi="TH Sarabun New" w:cs="TH Sarabun New"/>
+                <w:sz w:val="30"/>
+                <w:szCs w:val="30"/>
+                <w:cs/>
+              </w:rPr>
+              <w:t xml:space="preserve">แสดงสาธารณะ บันทึกภาพ บันทึกเสียง ภาพถ่าย </w:t>
+            </w:r>
+            <w:r>
+              <w:rPr>
+                <w:rFonts w:ascii="TH Sarabun New" w:hAnsi="TH Sarabun New" w:cs="TH Sarabun New"/>
+                <w:sz w:val="30"/>
+                <w:szCs w:val="30"/>
+                <w:cs/>
+              </w:rPr>
+              <w:t xml:space="preserve">แถบบันทึกภาพ</w:t>
             </w:r>
           </w:p>
           <w:p>
@@ -9199,15 +9140,6 @@
               </w:rPr>
               <w:t xml:space="preserve">จัดนิทรรศการ จัดแสดง จัดการแสดง </w:t>
             </w:r>
-          </w:p>
-          <w:p>
-            <w:pPr>
-              <w:rPr>
-                <w:rFonts w:ascii="TH Sarabun New" w:hAnsi="TH Sarabun New" w:cs="TH Sarabun New"/>
-                <w:sz w:val="30"/>
-                <w:szCs w:val="30"/>
-              </w:rPr>
-            </w:pPr>
             <w:r>
               <w:rPr>
                 <w:rFonts w:ascii="TH Sarabun New" w:hAnsi="TH Sarabun New" w:cs="TH Sarabun New"/>
@@ -9216,25 +9148,16 @@
                 <w:cs/>
               </w:rPr>
               <w:lastRenderedPageBreak/>
-              <w:t xml:space="preserve">     แสดงสาธารณะ บันทึกภาพ บันทึกเสียง ภาพถ่าย  </w:t>
-            </w:r>
-          </w:p>
-          <w:p>
-            <w:pPr>
-              <w:rPr>
-                <w:rFonts w:ascii="TH Sarabun New" w:hAnsi="TH Sarabun New" w:cs="TH Sarabun New"/>
-                <w:sz w:val="30"/>
-                <w:szCs w:val="30"/>
-              </w:rPr>
-            </w:pPr>
-            <w:r>
-              <w:rPr>
-                <w:rFonts w:ascii="TH Sarabun New" w:hAnsi="TH Sarabun New" w:cs="TH Sarabun New"/>
-                <w:sz w:val="30"/>
-                <w:szCs w:val="30"/>
-                <w:cs/>
-              </w:rPr>
-              <w:t xml:space="preserve">     แถบบันทึกภาพ</w:t>
+              <w:t xml:space="preserve">แสดงสาธารณะ บันทึกภาพ บันทึกเสียง ภาพถ่าย </w:t>
+            </w:r>
+            <w:r>
+              <w:rPr>
+                <w:rFonts w:ascii="TH Sarabun New" w:hAnsi="TH Sarabun New" w:cs="TH Sarabun New"/>
+                <w:sz w:val="30"/>
+                <w:szCs w:val="30"/>
+                <w:cs/>
+              </w:rPr>
+              <w:t xml:space="preserve">แถบบันทึกภาพ</w:t>
             </w:r>
           </w:p>
           <w:p>
@@ -10885,26 +10808,16 @@
                 <w:szCs w:val="30"/>
                 <w:cs/>
               </w:rPr>
-              <w:t xml:space="preserve"> </w:t>
-            </w:r>
-          </w:p>
-          <w:p>
-            <w:pPr>
-              <w:jc w:val="thaiDistribute"/>
-              <w:rPr>
-                <w:rFonts w:ascii="TH Sarabun New" w:hAnsi="TH Sarabun New" w:cs="TH Sarabun New"/>
-                <w:sz w:val="30"/>
-                <w:szCs w:val="30"/>
-              </w:rPr>
-            </w:pPr>
-            <w:r>
-              <w:rPr>
-                <w:rFonts w:ascii="TH Sarabun New" w:hAnsi="TH Sarabun New" w:cs="TH Sarabun New"/>
-                <w:sz w:val="30"/>
-                <w:szCs w:val="30"/>
-                <w:cs/>
-              </w:rPr>
-              <w:t xml:space="preserve">           </w:t>
+              <w:t xml:space="preserve"/>
+            </w:r>
+            <w:r>
+              <w:rPr>
+                <w:rFonts w:ascii="TH Sarabun New" w:hAnsi="TH Sarabun New" w:cs="TH Sarabun New"/>
+                <w:sz w:val="30"/>
+                <w:szCs w:val="30"/>
+                <w:cs/>
+              </w:rPr>
+              <w:t xml:space="preserve"/>
             </w:r>
             <w:r>
               <w:rPr>

</xml_diff>